<commit_message>
Write bullets from HTML the way Word draws its own
disc, circle and square became Unicode bullets in the text font, which
Word draws smaller and on a different baseline than the bullets of a
list made in Word. They are now Word's own: U+F0B7 in Symbol, o in
Courier New and U+F0A7 in Wingdings, which the DOCX reader already maps
back to disc, circle and square.

Co-Authored-By: Claude Opus 5 <noreply@anthropic.com>
</commit_message>
<xml_diff>
--- a/examples/roundtrip.docx
+++ b/examples/roundtrip.docx
@@ -1807,11 +1807,14 @@
     <w:lvl w:ilvl="0">
       <w:start w:val="1"/>
       <w:numFmt w:val="bullet"/>
-      <w:lvlText w:val="•"/>
+      <w:lvlText w:val=""/>
       <w:lvlJc w:val="left"/>
       <w:pPr>
         <w:ind w:left="720" w:hanging="360"/>
       </w:pPr>
+      <w:rPr>
+        <w:rFonts w:ascii="Symbol" w:hAnsi="Symbol" w:hint="default"/>
+      </w:rPr>
     </w:lvl>
     <w:lvl w:ilvl="1">
       <w:start w:val="1"/>
@@ -1900,11 +1903,14 @@
     <w:lvl w:ilvl="1">
       <w:start w:val="1"/>
       <w:numFmt w:val="bullet"/>
-      <w:lvlText w:val="◦"/>
+      <w:lvlText w:val="o"/>
       <w:lvlJc w:val="left"/>
       <w:pPr>
         <w:ind w:left="1440" w:hanging="360"/>
       </w:pPr>
+      <w:rPr>
+        <w:rFonts w:ascii="Courier New" w:hAnsi="Courier New" w:hint="default"/>
+      </w:rPr>
     </w:lvl>
     <w:lvl w:ilvl="2">
       <w:start w:val="1"/>

</xml_diff>

<commit_message>
Target SunEditor 3 in the SunEditor profile
SunEditor 3 changed what a document looks like: Helvetica Neue 16px,
links without underline, markers inside the first line, a line height of
1.5em on every element (a run no longer inherits its paragraph's), tables
without margins in a scrolling figure, math as span.se-math with
data-se-value, image sizes in data-se-size.

The profile stylesheet is SunEditor 3's; the writer writes its markup and
gives a run its paragraph's line height where the stylesheet would give it
another; the reader reads both 3's and 2's markup. Lists whose markers sit
inside the first line become Word lists with no hanging indent and a space
after the marker (ListLevel::$suffix, w:suff), and back.

Through SunEditor 3, DOCX -> HTML body ink: long 33.4% -> 97.7%, lists
10.4% -> 96.2%, typography 75.4% -> 98.1%, tables 46.4% -> 83.1%.
HTML -> DOCX: suneditor-lists 92.6%, text 92.4%, images 93.6%.

Co-Authored-By: Claude Opus 5 <noreply@anthropic.com>
</commit_message>
<xml_diff>
--- a/examples/roundtrip.docx
+++ b/examples/roundtrip.docx
@@ -2202,7 +2202,7 @@
     <w:pPr>
       <w:keepNext/>
       <w:keepLines/>
-      <w:spacing w:before="261" w:after="261"/>
+      <w:spacing w:before="322" w:after="322"/>
       <w:outlineLvl w:val="0"/>
     </w:pPr>
     <w:rPr>
@@ -2210,8 +2210,8 @@
       <w:b/>
       <w:bCs/>
       <w:color w:val="333333"/>
-      <w:sz w:val="39"/>
-      <w:szCs w:val="39"/>
+      <w:sz w:val="48"/>
+      <w:szCs w:val="48"/>
     </w:rPr>
   </w:style>
   <w:style w:type="paragraph" w:styleId="Heading2">
@@ -2223,7 +2223,7 @@
     <w:pPr>
       <w:keepNext/>
       <w:keepLines/>
-      <w:spacing w:before="243" w:after="243"/>
+      <w:spacing w:before="299" w:after="299"/>
       <w:outlineLvl w:val="1"/>
     </w:pPr>
     <w:rPr>
@@ -2231,8 +2231,8 @@
       <w:b/>
       <w:bCs/>
       <w:color w:val="333333"/>
-      <w:sz w:val="29"/>
-      <w:szCs w:val="29"/>
+      <w:sz w:val="36"/>
+      <w:szCs w:val="36"/>
     </w:rPr>
   </w:style>
   <w:style w:type="paragraph" w:styleId="Heading3">
@@ -2244,7 +2244,7 @@
     <w:pPr>
       <w:keepNext/>
       <w:keepLines/>
-      <w:spacing w:before="228" w:after="228"/>
+      <w:spacing w:before="281" w:after="281"/>
       <w:outlineLvl w:val="2"/>
     </w:pPr>
     <w:rPr>
@@ -2252,8 +2252,8 @@
       <w:b/>
       <w:bCs/>
       <w:color w:val="333333"/>
-      <w:sz w:val="23"/>
-      <w:szCs w:val="23"/>
+      <w:sz w:val="28"/>
+      <w:szCs w:val="28"/>
     </w:rPr>
   </w:style>
   <w:style w:type="paragraph" w:styleId="Heading4">
@@ -2265,7 +2265,7 @@
     <w:pPr>
       <w:keepNext/>
       <w:keepLines/>
-      <w:spacing w:before="259" w:after="259"/>
+      <w:spacing w:before="319" w:after="319"/>
       <w:outlineLvl w:val="3"/>
     </w:pPr>
     <w:rPr>
@@ -2273,8 +2273,8 @@
       <w:b/>
       <w:bCs/>
       <w:color w:val="333333"/>
-      <w:sz w:val="20"/>
-      <w:szCs w:val="20"/>
+      <w:sz w:val="24"/>
+      <w:szCs w:val="24"/>
     </w:rPr>
   </w:style>
   <w:style w:type="paragraph" w:styleId="Heading5">
@@ -2286,7 +2286,7 @@
     <w:pPr>
       <w:keepNext/>
       <w:keepLines/>
-      <w:spacing w:before="270" w:after="270"/>
+      <w:spacing w:before="333" w:after="333"/>
       <w:outlineLvl w:val="4"/>
     </w:pPr>
     <w:rPr>
@@ -2294,8 +2294,8 @@
       <w:b/>
       <w:bCs/>
       <w:color w:val="333333"/>
-      <w:sz w:val="16"/>
-      <w:szCs w:val="16"/>
+      <w:sz w:val="20"/>
+      <w:szCs w:val="20"/>
     </w:rPr>
   </w:style>
   <w:style w:type="paragraph" w:styleId="Heading6">
@@ -2307,7 +2307,7 @@
     <w:pPr>
       <w:keepNext/>
       <w:keepLines/>
-      <w:spacing w:before="304" w:after="304"/>
+      <w:spacing w:before="375" w:after="375"/>
       <w:outlineLvl w:val="5"/>
     </w:pPr>
     <w:rPr>
@@ -2315,8 +2315,8 @@
       <w:b/>
       <w:bCs/>
       <w:color w:val="333333"/>
-      <w:sz w:val="13"/>
-      <w:szCs w:val="13"/>
+      <w:sz w:val="16"/>
+      <w:szCs w:val="16"/>
     </w:rPr>
   </w:style>
   <w:style w:type="paragraph" w:styleId="Caption">
@@ -2329,8 +2329,8 @@
     <w:rPr>
       <w:rFonts w:ascii="Helvetica Neue" w:hAnsi="Helvetica Neue" w:eastAsia="Helvetica Neue" w:cs="Helvetica Neue"/>
       <w:color w:val="333333"/>
-      <w:sz w:val="20"/>
-      <w:szCs w:val="20"/>
+      <w:sz w:val="24"/>
+      <w:szCs w:val="24"/>
     </w:rPr>
   </w:style>
   <w:style w:type="character" w:default="1" w:styleId="DefaultParagraphFont">

</xml_diff>